<commit_message>
docs: single revision history row with status Submitted
Co-Authored-By: Claude Opus 5.5 <noreply@anthropic.com>
Claude-Session: https://claude.ai/code/session_01ARPB56pPYUtRWzuV5d9tPA
</commit_message>
<xml_diff>
--- a/docs/Java-Zorel-SDD.docx
+++ b/docs/Java-Zorel-SDD.docx
@@ -280,7 +280,7 @@
           <w:sz w:val="32"/>
           <w:szCs w:val="32"/>
         </w:rPr>
-        <w:t xml:space="preserve">Status: Final</w:t>
+        <w:t xml:space="preserve">Status: Submitted</w:t>
       </w:r>
     </w:p>
     <w:p>
@@ -543,7 +543,7 @@
                 <w:kern w:val="0"/>
                 <w14:ligatures w14:val="none"/>
               </w:rPr>
-              <w:t xml:space="preserve">0.1</w:t>
+              <w:t xml:space="preserve">1.0</w:t>
             </w:r>
           </w:p>
         </w:tc>
@@ -645,7 +645,7 @@
                 <w:kern w:val="0"/>
                 <w14:ligatures w14:val="none"/>
               </w:rPr>
-              <w:t xml:space="preserve">Initial draft: system description</w:t>
+              <w:t xml:space="preserve">Initial version: system description, feature list, business rules, and data model</w:t>
             </w:r>
           </w:p>
         </w:tc>
@@ -679,707 +679,7 @@
                 <w:kern w:val="0"/>
                 <w14:ligatures w14:val="none"/>
               </w:rPr>
-              <w:t xml:space="preserve">Draft</w:t>
-            </w:r>
-          </w:p>
-        </w:tc>
-      </w:tr>
-      <w:tr>
-        <w:trPr>
-          <w:trHeight w:val="288"/>
-        </w:trPr>
-        <w:tc>
-          <w:tcPr>
-            <w:tcW w:w="1036" w:type="dxa"/>
-            <w:tcBorders>
-              <w:top w:val="nil"/>
-              <w:left w:val="single" w:sz="4" w:space="0" w:color="auto"/>
-              <w:bottom w:val="single" w:sz="4" w:space="0" w:color="auto"/>
-              <w:right w:val="single" w:sz="4" w:space="0" w:color="auto"/>
-            </w:tcBorders>
-            <w:shd w:val="clear" w:color="000000" w:fill="FFFFFF"/>
-            <w:vAlign w:val="center"/>
-            <w:hideMark/>
-          </w:tcPr>
-          <w:p>
-            <w:pPr>
-              <w:spacing w:after="0" w:line="240" w:lineRule="auto"/>
-              <w:rPr>
-                <w:rFonts w:asciiTheme="majorHAnsi" w:eastAsia="Times New Roman" w:hAnsiTheme="majorHAnsi" w:cs="Segoe UI"/>
-                <w:color w:val="0F1115"/>
-                <w:kern w:val="0"/>
-                <w14:ligatures w14:val="none"/>
-              </w:rPr>
-            </w:pPr>
-            <w:r>
-              <w:rPr>
-                <w:rFonts w:asciiTheme="majorHAnsi" w:eastAsia="Times New Roman" w:hAnsiTheme="majorHAnsi" w:cs="Segoe UI"/>
-                <w:color w:val="0F1115"/>
-                <w:kern w:val="0"/>
-                <w14:ligatures w14:val="none"/>
-              </w:rPr>
-              <w:t xml:space="preserve">0.2</w:t>
-            </w:r>
-          </w:p>
-        </w:tc>
-        <w:tc>
-          <w:tcPr>
-            <w:tcW w:w="1479" w:type="dxa"/>
-            <w:tcBorders>
-              <w:top w:val="nil"/>
-              <w:left w:val="nil"/>
-              <w:bottom w:val="single" w:sz="4" w:space="0" w:color="auto"/>
-              <w:right w:val="single" w:sz="4" w:space="0" w:color="auto"/>
-            </w:tcBorders>
-            <w:shd w:val="clear" w:color="000000" w:fill="FFFFFF"/>
-            <w:vAlign w:val="center"/>
-            <w:hideMark/>
-          </w:tcPr>
-          <w:p>
-            <w:pPr>
-              <w:spacing w:after="0" w:line="240" w:lineRule="auto"/>
-              <w:rPr>
-                <w:rFonts w:asciiTheme="majorHAnsi" w:eastAsia="Times New Roman" w:hAnsiTheme="majorHAnsi" w:cs="Segoe UI"/>
-                <w:color w:val="0F1115"/>
-                <w:kern w:val="0"/>
-                <w14:ligatures w14:val="none"/>
-              </w:rPr>
-            </w:pPr>
-            <w:r>
-              <w:rPr>
-                <w:rFonts w:asciiTheme="majorHAnsi" w:eastAsia="Times New Roman" w:hAnsiTheme="majorHAnsi" w:cs="Segoe UI"/>
-                <w:color w:val="0F1115"/>
-                <w:kern w:val="0"/>
-                <w14:ligatures w14:val="none"/>
-              </w:rPr>
-              <w:t xml:space="preserve">Oct 9, 2026</w:t>
-            </w:r>
-          </w:p>
-        </w:tc>
-        <w:tc>
-          <w:tcPr>
-            <w:tcW w:w="2250" w:type="dxa"/>
-            <w:tcBorders>
-              <w:top w:val="nil"/>
-              <w:left w:val="nil"/>
-              <w:bottom w:val="single" w:sz="4" w:space="0" w:color="auto"/>
-              <w:right w:val="single" w:sz="4" w:space="0" w:color="auto"/>
-            </w:tcBorders>
-            <w:shd w:val="clear" w:color="000000" w:fill="FFFFFF"/>
-            <w:vAlign w:val="center"/>
-            <w:hideMark/>
-          </w:tcPr>
-          <w:p>
-            <w:pPr>
-              <w:spacing w:after="0" w:line="240" w:lineRule="auto"/>
-              <w:rPr>
-                <w:rFonts w:asciiTheme="majorHAnsi" w:eastAsia="Times New Roman" w:hAnsiTheme="majorHAnsi" w:cs="Segoe UI"/>
-                <w:color w:val="0F1115"/>
-                <w:kern w:val="0"/>
-                <w14:ligatures w14:val="none"/>
-              </w:rPr>
-            </w:pPr>
-            <w:r>
-              <w:rPr>
-                <w:rFonts w:asciiTheme="majorHAnsi" w:eastAsia="Times New Roman" w:hAnsiTheme="majorHAnsi" w:cs="Segoe UI"/>
-                <w:color w:val="0F1115"/>
-                <w:kern w:val="0"/>
-                <w14:ligatures w14:val="none"/>
-              </w:rPr>
-              <w:t xml:space="preserve">Zorel Adrean R. Java</w:t>
-            </w:r>
-          </w:p>
-        </w:tc>
-        <w:tc>
-          <w:tcPr>
-            <w:tcW w:w="2610" w:type="dxa"/>
-            <w:tcBorders>
-              <w:top w:val="nil"/>
-              <w:left w:val="nil"/>
-              <w:bottom w:val="single" w:sz="4" w:space="0" w:color="auto"/>
-              <w:right w:val="single" w:sz="4" w:space="0" w:color="auto"/>
-            </w:tcBorders>
-            <w:shd w:val="clear" w:color="000000" w:fill="FFFFFF"/>
-            <w:vAlign w:val="center"/>
-            <w:hideMark/>
-          </w:tcPr>
-          <w:p>
-            <w:pPr>
-              <w:spacing w:after="0" w:line="240" w:lineRule="auto"/>
-              <w:rPr>
-                <w:rFonts w:asciiTheme="majorHAnsi" w:eastAsia="Times New Roman" w:hAnsiTheme="majorHAnsi" w:cs="Segoe UI"/>
-                <w:color w:val="0F1115"/>
-                <w:kern w:val="0"/>
-                <w14:ligatures w14:val="none"/>
-              </w:rPr>
-            </w:pPr>
-            <w:r>
-              <w:rPr>
-                <w:rFonts w:asciiTheme="majorHAnsi" w:eastAsia="Times New Roman" w:hAnsiTheme="majorHAnsi" w:cs="Segoe UI"/>
-                <w:color w:val="0F1115"/>
-                <w:kern w:val="0"/>
-                <w14:ligatures w14:val="none"/>
-              </w:rPr>
-              <w:t xml:space="preserve">Added feature list</w:t>
-            </w:r>
-          </w:p>
-        </w:tc>
-        <w:tc>
-          <w:tcPr>
-            <w:tcW w:w="2070" w:type="dxa"/>
-            <w:tcBorders>
-              <w:top w:val="nil"/>
-              <w:left w:val="nil"/>
-              <w:bottom w:val="single" w:sz="4" w:space="0" w:color="auto"/>
-              <w:right w:val="single" w:sz="4" w:space="0" w:color="auto"/>
-            </w:tcBorders>
-            <w:shd w:val="clear" w:color="000000" w:fill="FFFFFF"/>
-            <w:vAlign w:val="center"/>
-            <w:hideMark/>
-          </w:tcPr>
-          <w:p>
-            <w:pPr>
-              <w:spacing w:after="0" w:line="240" w:lineRule="auto"/>
-              <w:rPr>
-                <w:rFonts w:asciiTheme="majorHAnsi" w:eastAsia="Times New Roman" w:hAnsiTheme="majorHAnsi" w:cs="Segoe UI"/>
-                <w:color w:val="0F1115"/>
-                <w:kern w:val="0"/>
-                <w14:ligatures w14:val="none"/>
-              </w:rPr>
-            </w:pPr>
-            <w:r>
-              <w:rPr>
-                <w:rFonts w:asciiTheme="majorHAnsi" w:eastAsia="Times New Roman" w:hAnsiTheme="majorHAnsi" w:cs="Segoe UI"/>
-                <w:color w:val="0F1115"/>
-                <w:kern w:val="0"/>
-                <w14:ligatures w14:val="none"/>
-              </w:rPr>
-              <w:t xml:space="preserve">Review</w:t>
-            </w:r>
-          </w:p>
-        </w:tc>
-      </w:tr>
-      <w:tr>
-        <w:trPr>
-          <w:trHeight w:val="288"/>
-        </w:trPr>
-        <w:tc>
-          <w:tcPr>
-            <w:tcW w:w="1036" w:type="dxa"/>
-            <w:tcBorders>
-              <w:top w:val="nil"/>
-              <w:left w:val="single" w:sz="4" w:space="0" w:color="auto"/>
-              <w:bottom w:val="single" w:sz="4" w:space="0" w:color="auto"/>
-              <w:right w:val="single" w:sz="4" w:space="0" w:color="auto"/>
-            </w:tcBorders>
-            <w:shd w:val="clear" w:color="000000" w:fill="FFFFFF"/>
-            <w:vAlign w:val="center"/>
-            <w:hideMark/>
-          </w:tcPr>
-          <w:p>
-            <w:pPr>
-              <w:spacing w:after="0" w:line="240" w:lineRule="auto"/>
-              <w:rPr>
-                <w:rFonts w:asciiTheme="majorHAnsi" w:eastAsia="Times New Roman" w:hAnsiTheme="majorHAnsi" w:cs="Segoe UI"/>
-                <w:color w:val="0F1115"/>
-                <w:kern w:val="0"/>
-                <w14:ligatures w14:val="none"/>
-              </w:rPr>
-            </w:pPr>
-            <w:r>
-              <w:rPr>
-                <w:rFonts w:asciiTheme="majorHAnsi" w:eastAsia="Times New Roman" w:hAnsiTheme="majorHAnsi" w:cs="Segoe UI"/>
-                <w:color w:val="0F1115"/>
-                <w:kern w:val="0"/>
-                <w14:ligatures w14:val="none"/>
-              </w:rPr>
-              <w:t xml:space="preserve">0.3</w:t>
-            </w:r>
-          </w:p>
-        </w:tc>
-        <w:tc>
-          <w:tcPr>
-            <w:tcW w:w="1479" w:type="dxa"/>
-            <w:tcBorders>
-              <w:top w:val="nil"/>
-              <w:left w:val="nil"/>
-              <w:bottom w:val="single" w:sz="4" w:space="0" w:color="auto"/>
-              <w:right w:val="single" w:sz="4" w:space="0" w:color="auto"/>
-            </w:tcBorders>
-            <w:shd w:val="clear" w:color="000000" w:fill="FFFFFF"/>
-            <w:vAlign w:val="center"/>
-            <w:hideMark/>
-          </w:tcPr>
-          <w:p>
-            <w:pPr>
-              <w:spacing w:after="0" w:line="240" w:lineRule="auto"/>
-              <w:rPr>
-                <w:rFonts w:asciiTheme="majorHAnsi" w:eastAsia="Times New Roman" w:hAnsiTheme="majorHAnsi" w:cs="Segoe UI"/>
-                <w:color w:val="0F1115"/>
-                <w:kern w:val="0"/>
-                <w14:ligatures w14:val="none"/>
-              </w:rPr>
-            </w:pPr>
-            <w:r>
-              <w:rPr>
-                <w:rFonts w:asciiTheme="majorHAnsi" w:eastAsia="Times New Roman" w:hAnsiTheme="majorHAnsi" w:cs="Segoe UI"/>
-                <w:color w:val="0F1115"/>
-                <w:kern w:val="0"/>
-                <w14:ligatures w14:val="none"/>
-              </w:rPr>
-              <w:t xml:space="preserve">Oct 9, 2026</w:t>
-            </w:r>
-          </w:p>
-        </w:tc>
-        <w:tc>
-          <w:tcPr>
-            <w:tcW w:w="2250" w:type="dxa"/>
-            <w:tcBorders>
-              <w:top w:val="nil"/>
-              <w:left w:val="nil"/>
-              <w:bottom w:val="single" w:sz="4" w:space="0" w:color="auto"/>
-              <w:right w:val="single" w:sz="4" w:space="0" w:color="auto"/>
-            </w:tcBorders>
-            <w:shd w:val="clear" w:color="000000" w:fill="FFFFFF"/>
-            <w:vAlign w:val="center"/>
-            <w:hideMark/>
-          </w:tcPr>
-          <w:p>
-            <w:pPr>
-              <w:spacing w:after="0" w:line="240" w:lineRule="auto"/>
-              <w:rPr>
-                <w:rFonts w:asciiTheme="majorHAnsi" w:eastAsia="Times New Roman" w:hAnsiTheme="majorHAnsi" w:cs="Segoe UI"/>
-                <w:color w:val="0F1115"/>
-                <w:kern w:val="0"/>
-                <w14:ligatures w14:val="none"/>
-              </w:rPr>
-            </w:pPr>
-            <w:r>
-              <w:rPr>
-                <w:rFonts w:asciiTheme="majorHAnsi" w:eastAsia="Times New Roman" w:hAnsiTheme="majorHAnsi" w:cs="Segoe UI"/>
-                <w:color w:val="0F1115"/>
-                <w:kern w:val="0"/>
-                <w14:ligatures w14:val="none"/>
-              </w:rPr>
-              <w:t xml:space="preserve">Zorel Adrean R. Java</w:t>
-            </w:r>
-          </w:p>
-        </w:tc>
-        <w:tc>
-          <w:tcPr>
-            <w:tcW w:w="2610" w:type="dxa"/>
-            <w:tcBorders>
-              <w:top w:val="nil"/>
-              <w:left w:val="nil"/>
-              <w:bottom w:val="single" w:sz="4" w:space="0" w:color="auto"/>
-              <w:right w:val="single" w:sz="4" w:space="0" w:color="auto"/>
-            </w:tcBorders>
-            <w:shd w:val="clear" w:color="000000" w:fill="FFFFFF"/>
-            <w:vAlign w:val="center"/>
-            <w:hideMark/>
-          </w:tcPr>
-          <w:p>
-            <w:pPr>
-              <w:spacing w:after="0" w:line="240" w:lineRule="auto"/>
-              <w:rPr>
-                <w:rFonts w:asciiTheme="majorHAnsi" w:eastAsia="Times New Roman" w:hAnsiTheme="majorHAnsi" w:cs="Segoe UI"/>
-                <w:color w:val="0F1115"/>
-                <w:kern w:val="0"/>
-                <w14:ligatures w14:val="none"/>
-              </w:rPr>
-            </w:pPr>
-            <w:r>
-              <w:rPr>
-                <w:rFonts w:asciiTheme="majorHAnsi" w:eastAsia="Times New Roman" w:hAnsiTheme="majorHAnsi" w:cs="Segoe UI"/>
-                <w:color w:val="0F1115"/>
-                <w:kern w:val="0"/>
-                <w14:ligatures w14:val="none"/>
-              </w:rPr>
-              <w:t xml:space="preserve">Added business rules</w:t>
-            </w:r>
-          </w:p>
-        </w:tc>
-        <w:tc>
-          <w:tcPr>
-            <w:tcW w:w="2070" w:type="dxa"/>
-            <w:tcBorders>
-              <w:top w:val="nil"/>
-              <w:left w:val="nil"/>
-              <w:bottom w:val="single" w:sz="4" w:space="0" w:color="auto"/>
-              <w:right w:val="single" w:sz="4" w:space="0" w:color="auto"/>
-            </w:tcBorders>
-            <w:shd w:val="clear" w:color="000000" w:fill="FFFFFF"/>
-            <w:vAlign w:val="center"/>
-            <w:hideMark/>
-          </w:tcPr>
-          <w:p>
-            <w:pPr>
-              <w:spacing w:after="0" w:line="240" w:lineRule="auto"/>
-              <w:rPr>
-                <w:rFonts w:asciiTheme="majorHAnsi" w:eastAsia="Times New Roman" w:hAnsiTheme="majorHAnsi" w:cs="Segoe UI"/>
-                <w:color w:val="0F1115"/>
-                <w:kern w:val="0"/>
-                <w14:ligatures w14:val="none"/>
-              </w:rPr>
-            </w:pPr>
-            <w:r>
-              <w:rPr>
-                <w:rFonts w:asciiTheme="majorHAnsi" w:eastAsia="Times New Roman" w:hAnsiTheme="majorHAnsi" w:cs="Segoe UI"/>
-                <w:color w:val="0F1115"/>
-                <w:kern w:val="0"/>
-                <w14:ligatures w14:val="none"/>
-              </w:rPr>
-              <w:t xml:space="preserve">Review</w:t>
-            </w:r>
-          </w:p>
-        </w:tc>
-      </w:tr>
-      <w:tr>
-        <w:trPr>
-          <w:trHeight w:val="288"/>
-        </w:trPr>
-        <w:tc>
-          <w:tcPr>
-            <w:tcW w:w="1036" w:type="dxa"/>
-            <w:tcBorders>
-              <w:top w:val="nil"/>
-              <w:left w:val="single" w:sz="4" w:space="0" w:color="auto"/>
-              <w:bottom w:val="single" w:sz="4" w:space="0" w:color="auto"/>
-              <w:right w:val="single" w:sz="4" w:space="0" w:color="auto"/>
-            </w:tcBorders>
-            <w:shd w:val="clear" w:color="000000" w:fill="FFFFFF"/>
-            <w:vAlign w:val="center"/>
-            <w:hideMark/>
-          </w:tcPr>
-          <w:p>
-            <w:pPr>
-              <w:spacing w:after="0" w:line="240" w:lineRule="auto"/>
-              <w:rPr>
-                <w:rFonts w:asciiTheme="majorHAnsi" w:eastAsia="Times New Roman" w:hAnsiTheme="majorHAnsi" w:cs="Segoe UI"/>
-                <w:color w:val="0F1115"/>
-                <w:kern w:val="0"/>
-                <w14:ligatures w14:val="none"/>
-              </w:rPr>
-            </w:pPr>
-            <w:r>
-              <w:rPr>
-                <w:rFonts w:asciiTheme="majorHAnsi" w:eastAsia="Times New Roman" w:hAnsiTheme="majorHAnsi" w:cs="Segoe UI"/>
-                <w:color w:val="0F1115"/>
-                <w:kern w:val="0"/>
-                <w14:ligatures w14:val="none"/>
-              </w:rPr>
-              <w:t xml:space="preserve">0.4</w:t>
-            </w:r>
-          </w:p>
-        </w:tc>
-        <w:tc>
-          <w:tcPr>
-            <w:tcW w:w="1479" w:type="dxa"/>
-            <w:tcBorders>
-              <w:top w:val="nil"/>
-              <w:left w:val="nil"/>
-              <w:bottom w:val="single" w:sz="4" w:space="0" w:color="auto"/>
-              <w:right w:val="single" w:sz="4" w:space="0" w:color="auto"/>
-            </w:tcBorders>
-            <w:shd w:val="clear" w:color="000000" w:fill="FFFFFF"/>
-            <w:vAlign w:val="center"/>
-            <w:hideMark/>
-          </w:tcPr>
-          <w:p>
-            <w:pPr>
-              <w:spacing w:after="0" w:line="240" w:lineRule="auto"/>
-              <w:rPr>
-                <w:rFonts w:asciiTheme="majorHAnsi" w:eastAsia="Times New Roman" w:hAnsiTheme="majorHAnsi" w:cs="Segoe UI"/>
-                <w:color w:val="0F1115"/>
-                <w:kern w:val="0"/>
-                <w14:ligatures w14:val="none"/>
-              </w:rPr>
-            </w:pPr>
-            <w:r>
-              <w:rPr>
-                <w:rFonts w:asciiTheme="majorHAnsi" w:eastAsia="Times New Roman" w:hAnsiTheme="majorHAnsi" w:cs="Segoe UI"/>
-                <w:color w:val="0F1115"/>
-                <w:kern w:val="0"/>
-                <w14:ligatures w14:val="none"/>
-              </w:rPr>
-              <w:t xml:space="preserve">Oct 9, 2026</w:t>
-            </w:r>
-          </w:p>
-        </w:tc>
-        <w:tc>
-          <w:tcPr>
-            <w:tcW w:w="2250" w:type="dxa"/>
-            <w:tcBorders>
-              <w:top w:val="nil"/>
-              <w:left w:val="nil"/>
-              <w:bottom w:val="single" w:sz="4" w:space="0" w:color="auto"/>
-              <w:right w:val="single" w:sz="4" w:space="0" w:color="auto"/>
-            </w:tcBorders>
-            <w:shd w:val="clear" w:color="000000" w:fill="FFFFFF"/>
-            <w:vAlign w:val="center"/>
-            <w:hideMark/>
-          </w:tcPr>
-          <w:p>
-            <w:pPr>
-              <w:spacing w:after="0" w:line="240" w:lineRule="auto"/>
-              <w:rPr>
-                <w:rFonts w:asciiTheme="majorHAnsi" w:eastAsia="Times New Roman" w:hAnsiTheme="majorHAnsi" w:cs="Segoe UI"/>
-                <w:color w:val="0F1115"/>
-                <w:kern w:val="0"/>
-                <w14:ligatures w14:val="none"/>
-              </w:rPr>
-            </w:pPr>
-            <w:r>
-              <w:rPr>
-                <w:rFonts w:asciiTheme="majorHAnsi" w:eastAsia="Times New Roman" w:hAnsiTheme="majorHAnsi" w:cs="Segoe UI"/>
-                <w:color w:val="0F1115"/>
-                <w:kern w:val="0"/>
-                <w14:ligatures w14:val="none"/>
-              </w:rPr>
-              <w:t xml:space="preserve">Zorel Adrean R. Java</w:t>
-            </w:r>
-          </w:p>
-        </w:tc>
-        <w:tc>
-          <w:tcPr>
-            <w:tcW w:w="2610" w:type="dxa"/>
-            <w:tcBorders>
-              <w:top w:val="nil"/>
-              <w:left w:val="nil"/>
-              <w:bottom w:val="single" w:sz="4" w:space="0" w:color="auto"/>
-              <w:right w:val="single" w:sz="4" w:space="0" w:color="auto"/>
-            </w:tcBorders>
-            <w:shd w:val="clear" w:color="000000" w:fill="FFFFFF"/>
-            <w:vAlign w:val="center"/>
-            <w:hideMark/>
-          </w:tcPr>
-          <w:p>
-            <w:pPr>
-              <w:spacing w:after="0" w:line="240" w:lineRule="auto"/>
-              <w:rPr>
-                <w:rFonts w:asciiTheme="majorHAnsi" w:eastAsia="Times New Roman" w:hAnsiTheme="majorHAnsi" w:cs="Segoe UI"/>
-                <w:color w:val="0F1115"/>
-                <w:kern w:val="0"/>
-                <w14:ligatures w14:val="none"/>
-              </w:rPr>
-            </w:pPr>
-            <w:r>
-              <w:rPr>
-                <w:rFonts w:asciiTheme="majorHAnsi" w:eastAsia="Times New Roman" w:hAnsiTheme="majorHAnsi" w:cs="Segoe UI"/>
-                <w:color w:val="0F1115"/>
-                <w:kern w:val="0"/>
-                <w14:ligatures w14:val="none"/>
-              </w:rPr>
-              <w:t xml:space="preserve">Added data model (ERD and data dictionary)</w:t>
-            </w:r>
-          </w:p>
-        </w:tc>
-        <w:tc>
-          <w:tcPr>
-            <w:tcW w:w="2070" w:type="dxa"/>
-            <w:tcBorders>
-              <w:top w:val="nil"/>
-              <w:left w:val="nil"/>
-              <w:bottom w:val="single" w:sz="4" w:space="0" w:color="auto"/>
-              <w:right w:val="single" w:sz="4" w:space="0" w:color="auto"/>
-            </w:tcBorders>
-            <w:shd w:val="clear" w:color="000000" w:fill="FFFFFF"/>
-            <w:vAlign w:val="center"/>
-            <w:hideMark/>
-          </w:tcPr>
-          <w:p>
-            <w:pPr>
-              <w:spacing w:after="0" w:line="240" w:lineRule="auto"/>
-              <w:rPr>
-                <w:rFonts w:asciiTheme="majorHAnsi" w:eastAsia="Times New Roman" w:hAnsiTheme="majorHAnsi" w:cs="Segoe UI"/>
-                <w:color w:val="0F1115"/>
-                <w:kern w:val="0"/>
-                <w14:ligatures w14:val="none"/>
-              </w:rPr>
-            </w:pPr>
-            <w:r>
-              <w:rPr>
-                <w:rFonts w:asciiTheme="majorHAnsi" w:eastAsia="Times New Roman" w:hAnsiTheme="majorHAnsi" w:cs="Segoe UI"/>
-                <w:color w:val="0F1115"/>
-                <w:kern w:val="0"/>
-                <w14:ligatures w14:val="none"/>
-              </w:rPr>
-              <w:t xml:space="preserve">Review</w:t>
-            </w:r>
-          </w:p>
-        </w:tc>
-      </w:tr>
-      <w:tr>
-        <w:trPr>
-          <w:trHeight w:val="288"/>
-        </w:trPr>
-        <w:tc>
-          <w:tcPr>
-            <w:tcW w:w="1036" w:type="dxa"/>
-            <w:tcBorders>
-              <w:top w:val="nil"/>
-              <w:left w:val="single" w:sz="4" w:space="0" w:color="auto"/>
-              <w:bottom w:val="single" w:sz="4" w:space="0" w:color="auto"/>
-              <w:right w:val="single" w:sz="4" w:space="0" w:color="auto"/>
-            </w:tcBorders>
-            <w:shd w:val="clear" w:color="000000" w:fill="FFFFFF"/>
-            <w:vAlign w:val="center"/>
-            <w:hideMark/>
-          </w:tcPr>
-          <w:p>
-            <w:pPr>
-              <w:spacing w:after="0" w:line="240" w:lineRule="auto"/>
-              <w:rPr>
-                <w:rFonts w:asciiTheme="majorHAnsi" w:eastAsia="Times New Roman" w:hAnsiTheme="majorHAnsi" w:cs="Segoe UI"/>
-                <w:color w:val="0F1115"/>
-                <w:kern w:val="0"/>
-                <w14:ligatures w14:val="none"/>
-              </w:rPr>
-            </w:pPr>
-            <w:r>
-              <w:rPr>
-                <w:rFonts w:asciiTheme="majorHAnsi" w:eastAsia="Times New Roman" w:hAnsiTheme="majorHAnsi" w:cs="Segoe UI"/>
-                <w:color w:val="0F1115"/>
-                <w:kern w:val="0"/>
-                <w14:ligatures w14:val="none"/>
-              </w:rPr>
-              <w:t xml:space="preserve">1.0</w:t>
-            </w:r>
-          </w:p>
-        </w:tc>
-        <w:tc>
-          <w:tcPr>
-            <w:tcW w:w="1479" w:type="dxa"/>
-            <w:tcBorders>
-              <w:top w:val="nil"/>
-              <w:left w:val="nil"/>
-              <w:bottom w:val="single" w:sz="4" w:space="0" w:color="auto"/>
-              <w:right w:val="single" w:sz="4" w:space="0" w:color="auto"/>
-            </w:tcBorders>
-            <w:shd w:val="clear" w:color="000000" w:fill="FFFFFF"/>
-            <w:vAlign w:val="center"/>
-            <w:hideMark/>
-          </w:tcPr>
-          <w:p>
-            <w:pPr>
-              <w:spacing w:after="0" w:line="240" w:lineRule="auto"/>
-              <w:rPr>
-                <w:rFonts w:asciiTheme="majorHAnsi" w:eastAsia="Times New Roman" w:hAnsiTheme="majorHAnsi" w:cs="Segoe UI"/>
-                <w:color w:val="0F1115"/>
-                <w:kern w:val="0"/>
-                <w14:ligatures w14:val="none"/>
-              </w:rPr>
-            </w:pPr>
-            <w:r>
-              <w:rPr>
-                <w:rFonts w:asciiTheme="majorHAnsi" w:eastAsia="Times New Roman" w:hAnsiTheme="majorHAnsi" w:cs="Segoe UI"/>
-                <w:color w:val="0F1115"/>
-                <w:kern w:val="0"/>
-                <w14:ligatures w14:val="none"/>
-              </w:rPr>
-              <w:t xml:space="preserve">Oct 9, 2026</w:t>
-            </w:r>
-          </w:p>
-        </w:tc>
-        <w:tc>
-          <w:tcPr>
-            <w:tcW w:w="2250" w:type="dxa"/>
-            <w:tcBorders>
-              <w:top w:val="nil"/>
-              <w:left w:val="nil"/>
-              <w:bottom w:val="single" w:sz="4" w:space="0" w:color="auto"/>
-              <w:right w:val="single" w:sz="4" w:space="0" w:color="auto"/>
-            </w:tcBorders>
-            <w:shd w:val="clear" w:color="000000" w:fill="FFFFFF"/>
-            <w:vAlign w:val="center"/>
-            <w:hideMark/>
-          </w:tcPr>
-          <w:p>
-            <w:pPr>
-              <w:spacing w:after="0" w:line="240" w:lineRule="auto"/>
-              <w:rPr>
-                <w:rFonts w:asciiTheme="majorHAnsi" w:eastAsia="Times New Roman" w:hAnsiTheme="majorHAnsi" w:cs="Segoe UI"/>
-                <w:color w:val="0F1115"/>
-                <w:kern w:val="0"/>
-                <w14:ligatures w14:val="none"/>
-              </w:rPr>
-            </w:pPr>
-            <w:r>
-              <w:rPr>
-                <w:rFonts w:asciiTheme="majorHAnsi" w:eastAsia="Times New Roman" w:hAnsiTheme="majorHAnsi" w:cs="Segoe UI"/>
-                <w:color w:val="0F1115"/>
-                <w:kern w:val="0"/>
-                <w14:ligatures w14:val="none"/>
-              </w:rPr>
-              <w:t xml:space="preserve">Zorel Adrean R. Java</w:t>
-            </w:r>
-          </w:p>
-        </w:tc>
-        <w:tc>
-          <w:tcPr>
-            <w:tcW w:w="2610" w:type="dxa"/>
-            <w:tcBorders>
-              <w:top w:val="nil"/>
-              <w:left w:val="nil"/>
-              <w:bottom w:val="single" w:sz="4" w:space="0" w:color="auto"/>
-              <w:right w:val="single" w:sz="4" w:space="0" w:color="auto"/>
-            </w:tcBorders>
-            <w:shd w:val="clear" w:color="000000" w:fill="FFFFFF"/>
-            <w:vAlign w:val="center"/>
-            <w:hideMark/>
-          </w:tcPr>
-          <w:p>
-            <w:pPr>
-              <w:spacing w:after="0" w:line="240" w:lineRule="auto"/>
-              <w:rPr>
-                <w:rFonts w:asciiTheme="majorHAnsi" w:eastAsia="Times New Roman" w:hAnsiTheme="majorHAnsi" w:cs="Segoe UI"/>
-                <w:color w:val="0F1115"/>
-                <w:kern w:val="0"/>
-                <w14:ligatures w14:val="none"/>
-              </w:rPr>
-            </w:pPr>
-            <w:r>
-              <w:rPr>
-                <w:rFonts w:asciiTheme="majorHAnsi" w:eastAsia="Times New Roman" w:hAnsiTheme="majorHAnsi" w:cs="Segoe UI"/>
-                <w:color w:val="0F1115"/>
-                <w:kern w:val="0"/>
-                <w14:ligatures w14:val="none"/>
-              </w:rPr>
-              <w:t xml:space="preserve">Version submitted for approval</w:t>
-            </w:r>
-          </w:p>
-        </w:tc>
-        <w:tc>
-          <w:tcPr>
-            <w:tcW w:w="2070" w:type="dxa"/>
-            <w:tcBorders>
-              <w:top w:val="nil"/>
-              <w:left w:val="nil"/>
-              <w:bottom w:val="single" w:sz="4" w:space="0" w:color="auto"/>
-              <w:right w:val="single" w:sz="4" w:space="0" w:color="auto"/>
-            </w:tcBorders>
-            <w:shd w:val="clear" w:color="000000" w:fill="FFFFFF"/>
-            <w:vAlign w:val="center"/>
-            <w:hideMark/>
-          </w:tcPr>
-          <w:p>
-            <w:pPr>
-              <w:spacing w:after="0" w:line="240" w:lineRule="auto"/>
-              <w:rPr>
-                <w:rFonts w:asciiTheme="majorHAnsi" w:eastAsia="Times New Roman" w:hAnsiTheme="majorHAnsi" w:cs="Segoe UI"/>
-                <w:color w:val="0F1115"/>
-                <w:kern w:val="0"/>
-                <w14:ligatures w14:val="none"/>
-              </w:rPr>
-            </w:pPr>
-            <w:r>
-              <w:rPr>
-                <w:rFonts w:asciiTheme="majorHAnsi" w:eastAsia="Times New Roman" w:hAnsiTheme="majorHAnsi" w:cs="Segoe UI"/>
-                <w:color w:val="0F1115"/>
-                <w:kern w:val="0"/>
-                <w14:ligatures w14:val="none"/>
-              </w:rPr>
-              <w:t xml:space="preserve">Final</w:t>
+              <w:t xml:space="preserve">Submitted</w:t>
             </w:r>
           </w:p>
         </w:tc>

</xml_diff>